<commit_message>
Add python coding version, refiner prompt
</commit_message>
<xml_diff>
--- a/PySupport/PreCudaParser/branch_eliminator_prompt.docx
+++ b/PySupport/PreCudaParser/branch_eliminator_prompt.docx
@@ -5,12 +5,60 @@
     <w:p>
       <w:pPr>
         <w:spacing w:after="0" w:line="240" w:lineRule="auto"/>
-      </w:pPr>
-      <w:r>
-        <w:t>You are transforming a sequence of expressions, written in Java or C++, that replace any branching implied by the ternary operator with explicit pre-evaluation of the alternative values and then selecting one of the pre-computed alternatives. For example</w:t>
-      </w:r>
-      <w:r>
-        <w:t xml:space="preserve">, the </w:t>
+        <w:rPr>
+          <w:b/>
+          <w:bCs/>
+        </w:rPr>
+      </w:pPr>
+      <w:r>
+        <w:rPr>
+          <w:b/>
+          <w:bCs/>
+        </w:rPr>
+        <w:t>Removing ternary IF Expressions</w:t>
+      </w:r>
+    </w:p>
+    <w:p>
+      <w:pPr>
+        <w:spacing w:after="0" w:line="240" w:lineRule="auto"/>
+      </w:pPr>
+    </w:p>
+    <w:p>
+      <w:pPr>
+        <w:spacing w:after="0" w:line="240" w:lineRule="auto"/>
+      </w:pPr>
+      <w:r>
+        <w:t xml:space="preserve">You are transforming C++ or Java </w:t>
+      </w:r>
+      <w:r>
+        <w:t xml:space="preserve">“main” </w:t>
+      </w:r>
+      <w:r>
+        <w:t>methods to remove ternary expressions. You will</w:t>
+      </w:r>
+      <w:r>
+        <w:t xml:space="preserve"> replace any branching implied by the ternary operator</w:t>
+      </w:r>
+      <w:r>
+        <w:t xml:space="preserve"> with equivalent code that does not branch. This is done</w:t>
+      </w:r>
+      <w:r>
+        <w:t xml:space="preserve"> with explicit pre-evaluation of the alternative values</w:t>
+      </w:r>
+      <w:r>
+        <w:t xml:space="preserve"> of the ternary IF and then selecting the appropriate value based on the selector expression.</w:t>
+      </w:r>
+      <w:r>
+        <w:t xml:space="preserve"> For example</w:t>
+      </w:r>
+      <w:r>
+        <w:t xml:space="preserve">, </w:t>
+      </w:r>
+      <w:r>
+        <w:t xml:space="preserve">consider </w:t>
+      </w:r>
+      <w:r>
+        <w:t xml:space="preserve">the </w:t>
       </w:r>
       <w:r>
         <w:t xml:space="preserve">following </w:t>
@@ -19,151 +67,10 @@
         <w:t xml:space="preserve">Java </w:t>
       </w:r>
       <w:r>
-        <w:t>expression sequence:</w:t>
-      </w:r>
-    </w:p>
-    <w:p>
-      <w:pPr>
-        <w:spacing w:after="0" w:line="240" w:lineRule="auto"/>
-      </w:pPr>
-    </w:p>
-    <w:p>
-      <w:pPr>
-        <w:spacing w:after="0" w:line="240" w:lineRule="auto"/>
-        <w:rPr>
-          <w:rFonts w:ascii="Lucida Console" w:hAnsi="Lucida Console"/>
-        </w:rPr>
-      </w:pPr>
-      <w:r>
-        <w:rPr>
-          <w:rFonts w:ascii="Lucida Console" w:hAnsi="Lucida Console"/>
-        </w:rPr>
-        <w:t>i</w:t>
-      </w:r>
-      <w:r>
-        <w:rPr>
-          <w:rFonts w:ascii="Lucida Console" w:hAnsi="Lucida Console"/>
-        </w:rPr>
-        <w:t xml:space="preserve">nt a = </w:t>
-      </w:r>
-      <w:r>
-        <w:rPr>
-          <w:rFonts w:ascii="Lucida Console" w:hAnsi="Lucida Console"/>
-        </w:rPr>
-        <w:t>7 + 22 * 83</w:t>
-      </w:r>
-      <w:r>
-        <w:rPr>
-          <w:rFonts w:ascii="Lucida Console" w:hAnsi="Lucida Console"/>
-        </w:rPr>
-        <w:t>;</w:t>
-      </w:r>
-    </w:p>
-    <w:p>
-      <w:pPr>
-        <w:spacing w:after="0" w:line="240" w:lineRule="auto"/>
-        <w:rPr>
-          <w:rFonts w:ascii="Lucida Console" w:hAnsi="Lucida Console"/>
-        </w:rPr>
-      </w:pPr>
-      <w:r>
-        <w:rPr>
-          <w:rFonts w:ascii="Lucida Console" w:hAnsi="Lucida Console"/>
-        </w:rPr>
-        <w:t>int b = a * 3 + 5;</w:t>
-      </w:r>
-    </w:p>
-    <w:p>
-      <w:pPr>
-        <w:spacing w:after="0" w:line="240" w:lineRule="auto"/>
-        <w:rPr>
-          <w:rFonts w:ascii="Lucida Console" w:hAnsi="Lucida Console"/>
-        </w:rPr>
-      </w:pPr>
-      <w:r>
-        <w:rPr>
-          <w:rFonts w:ascii="Lucida Console" w:hAnsi="Lucida Console"/>
-        </w:rPr>
-        <w:t xml:space="preserve">int c = (a / 2 &gt; </w:t>
-      </w:r>
-      <w:r>
-        <w:rPr>
-          <w:rFonts w:ascii="Lucida Console" w:hAnsi="Lucida Console"/>
-        </w:rPr>
-        <w:t>11 * b</w:t>
-      </w:r>
-      <w:proofErr w:type="gramStart"/>
-      <w:r>
-        <w:rPr>
-          <w:rFonts w:ascii="Lucida Console" w:hAnsi="Lucida Console"/>
-        </w:rPr>
-        <w:t>) ?</w:t>
-      </w:r>
-      <w:proofErr w:type="gramEnd"/>
-      <w:r>
-        <w:rPr>
-          <w:rFonts w:ascii="Lucida Console" w:hAnsi="Lucida Console"/>
-        </w:rPr>
-        <w:t xml:space="preserve"> a + </w:t>
-      </w:r>
-      <w:proofErr w:type="gramStart"/>
-      <w:r>
-        <w:rPr>
-          <w:rFonts w:ascii="Lucida Console" w:hAnsi="Lucida Console"/>
-        </w:rPr>
-        <w:t>b :</w:t>
-      </w:r>
-      <w:proofErr w:type="gramEnd"/>
-      <w:r>
-        <w:rPr>
-          <w:rFonts w:ascii="Lucida Console" w:hAnsi="Lucida Console"/>
-        </w:rPr>
-        <w:t xml:space="preserve">  </w:t>
-      </w:r>
-      <w:r>
-        <w:rPr>
-          <w:rFonts w:ascii="Lucida Console" w:hAnsi="Lucida Console"/>
-        </w:rPr>
-        <w:t>a – b;</w:t>
-      </w:r>
-    </w:p>
-    <w:p>
-      <w:pPr>
-        <w:spacing w:after="0" w:line="240" w:lineRule="auto"/>
-        <w:rPr>
-          <w:rFonts w:ascii="Lucida Console" w:hAnsi="Lucida Console"/>
-        </w:rPr>
-      </w:pPr>
-      <w:r>
-        <w:rPr>
-          <w:rFonts w:ascii="Lucida Console" w:hAnsi="Lucida Console"/>
-        </w:rPr>
-        <w:t xml:space="preserve">int d = 4700 / </w:t>
-      </w:r>
-      <w:r>
-        <w:rPr>
-          <w:rFonts w:ascii="Lucida Console" w:hAnsi="Lucida Console"/>
-        </w:rPr>
-        <w:t>c</w:t>
-      </w:r>
-      <w:r>
-        <w:rPr>
-          <w:rFonts w:ascii="Lucida Console" w:hAnsi="Lucida Console"/>
-        </w:rPr>
-        <w:t>;</w:t>
-      </w:r>
-    </w:p>
-    <w:p>
-      <w:pPr>
-        <w:spacing w:after="0" w:line="240" w:lineRule="auto"/>
-      </w:pPr>
-    </w:p>
-    <w:p>
-      <w:pPr>
-        <w:spacing w:after="0" w:line="240" w:lineRule="auto"/>
-      </w:pPr>
-      <w:r>
-        <w:t>transforms to this Java sequence</w:t>
+        <w:t>expression sequence</w:t>
+      </w:r>
+      <w:r>
+        <w:t xml:space="preserve"> shown below</w:t>
       </w:r>
       <w:r>
         <w:t>:</w:t>
@@ -179,238 +86,730 @@
         <w:spacing w:after="0" w:line="240" w:lineRule="auto"/>
         <w:rPr>
           <w:rFonts w:ascii="Lucida Console" w:hAnsi="Lucida Console"/>
-        </w:rPr>
-      </w:pPr>
-      <w:r>
-        <w:rPr>
-          <w:rFonts w:ascii="Lucida Console" w:hAnsi="Lucida Console"/>
-        </w:rPr>
-        <w:t>int a = 7 + 22 * 83;</w:t>
-      </w:r>
-    </w:p>
-    <w:p>
-      <w:pPr>
-        <w:spacing w:after="0" w:line="240" w:lineRule="auto"/>
-        <w:rPr>
-          <w:rFonts w:ascii="Lucida Console" w:hAnsi="Lucida Console"/>
-        </w:rPr>
-      </w:pPr>
-      <w:r>
-        <w:rPr>
-          <w:rFonts w:ascii="Lucida Console" w:hAnsi="Lucida Console"/>
-        </w:rPr>
-        <w:t>int b = a * 3 + 5;</w:t>
-      </w:r>
-    </w:p>
-    <w:p>
-      <w:pPr>
-        <w:spacing w:after="0" w:line="240" w:lineRule="auto"/>
-        <w:rPr>
-          <w:rFonts w:ascii="Lucida Console" w:hAnsi="Lucida Console"/>
-        </w:rPr>
-      </w:pPr>
-      <w:proofErr w:type="gramStart"/>
-      <w:r>
-        <w:rPr>
-          <w:rFonts w:ascii="Lucida Console" w:hAnsi="Lucida Console"/>
-        </w:rPr>
-        <w:t>int[</w:t>
-      </w:r>
-      <w:proofErr w:type="gramEnd"/>
-      <w:r>
-        <w:rPr>
-          <w:rFonts w:ascii="Lucida Console" w:hAnsi="Lucida Console"/>
-        </w:rPr>
-        <w:t xml:space="preserve">2] </w:t>
-      </w:r>
-      <w:proofErr w:type="spellStart"/>
-      <w:r>
-        <w:rPr>
-          <w:rFonts w:ascii="Lucida Console" w:hAnsi="Lucida Console"/>
-        </w:rPr>
-        <w:t>cval</w:t>
-      </w:r>
-      <w:proofErr w:type="spellEnd"/>
-      <w:r>
-        <w:rPr>
-          <w:rFonts w:ascii="Lucida Console" w:hAnsi="Lucida Console"/>
-        </w:rPr>
-        <w:t xml:space="preserve"> = new </w:t>
-      </w:r>
-      <w:proofErr w:type="gramStart"/>
-      <w:r>
-        <w:rPr>
-          <w:rFonts w:ascii="Lucida Console" w:hAnsi="Lucida Console"/>
-        </w:rPr>
-        <w:t>int[</w:t>
-      </w:r>
-      <w:proofErr w:type="gramEnd"/>
-      <w:r>
-        <w:rPr>
-          <w:rFonts w:ascii="Lucida Console" w:hAnsi="Lucida Console"/>
-        </w:rPr>
-        <w:t>2];</w:t>
-      </w:r>
-    </w:p>
-    <w:p>
-      <w:pPr>
-        <w:spacing w:after="0" w:line="240" w:lineRule="auto"/>
-        <w:rPr>
-          <w:rFonts w:ascii="Lucida Console" w:hAnsi="Lucida Console"/>
-        </w:rPr>
-      </w:pPr>
-      <w:proofErr w:type="spellStart"/>
-      <w:proofErr w:type="gramStart"/>
-      <w:r>
-        <w:rPr>
-          <w:rFonts w:ascii="Lucida Console" w:hAnsi="Lucida Console"/>
-        </w:rPr>
-        <w:t>cval</w:t>
-      </w:r>
-      <w:proofErr w:type="spellEnd"/>
-      <w:r>
-        <w:rPr>
-          <w:rFonts w:ascii="Lucida Console" w:hAnsi="Lucida Console"/>
-        </w:rPr>
-        <w:t>[</w:t>
-      </w:r>
-      <w:proofErr w:type="gramEnd"/>
-      <w:r>
-        <w:rPr>
-          <w:rFonts w:ascii="Lucida Console" w:hAnsi="Lucida Console"/>
-        </w:rPr>
-        <w:t>0] = a + b;</w:t>
-      </w:r>
-    </w:p>
-    <w:p>
-      <w:pPr>
-        <w:spacing w:after="0" w:line="240" w:lineRule="auto"/>
-        <w:rPr>
-          <w:rFonts w:ascii="Lucida Console" w:hAnsi="Lucida Console"/>
-        </w:rPr>
-      </w:pPr>
-      <w:proofErr w:type="spellStart"/>
-      <w:proofErr w:type="gramStart"/>
-      <w:r>
-        <w:rPr>
-          <w:rFonts w:ascii="Lucida Console" w:hAnsi="Lucida Console"/>
-        </w:rPr>
-        <w:t>cval</w:t>
-      </w:r>
-      <w:proofErr w:type="spellEnd"/>
-      <w:r>
-        <w:rPr>
-          <w:rFonts w:ascii="Lucida Console" w:hAnsi="Lucida Console"/>
-        </w:rPr>
-        <w:t>[</w:t>
-      </w:r>
-      <w:proofErr w:type="gramEnd"/>
-      <w:r>
-        <w:rPr>
-          <w:rFonts w:ascii="Lucida Console" w:hAnsi="Lucida Console"/>
-        </w:rPr>
-        <w:t>1] = a – b;</w:t>
-      </w:r>
-    </w:p>
-    <w:p>
-      <w:pPr>
-        <w:spacing w:after="0" w:line="240" w:lineRule="auto"/>
-        <w:rPr>
-          <w:rFonts w:ascii="Lucida Console" w:hAnsi="Lucida Console"/>
-        </w:rPr>
-      </w:pPr>
-      <w:r>
-        <w:rPr>
-          <w:rFonts w:ascii="Lucida Console" w:hAnsi="Lucida Console"/>
-        </w:rPr>
-        <w:t xml:space="preserve">int chooser = </w:t>
-      </w:r>
-      <w:proofErr w:type="spellStart"/>
-      <w:r>
-        <w:rPr>
-          <w:rFonts w:ascii="Lucida Console" w:hAnsi="Lucida Console"/>
-        </w:rPr>
-        <w:t>Boolean.compare</w:t>
-      </w:r>
-      <w:proofErr w:type="spellEnd"/>
-      <w:r>
-        <w:rPr>
-          <w:rFonts w:ascii="Lucida Console" w:hAnsi="Lucida Console"/>
-        </w:rPr>
-        <w:t>(</w:t>
-      </w:r>
-      <w:r>
-        <w:rPr>
-          <w:rFonts w:ascii="Lucida Console" w:hAnsi="Lucida Console"/>
-        </w:rPr>
-        <w:t>a / 2 &gt; 11 * b</w:t>
-      </w:r>
-      <w:r>
-        <w:rPr>
-          <w:rFonts w:ascii="Lucida Console" w:hAnsi="Lucida Console"/>
-        </w:rPr>
-        <w:t>, false)</w:t>
-      </w:r>
-    </w:p>
-    <w:p>
-      <w:pPr>
-        <w:spacing w:after="0" w:line="240" w:lineRule="auto"/>
-        <w:rPr>
-          <w:rFonts w:ascii="Lucida Console" w:hAnsi="Lucida Console"/>
-        </w:rPr>
-      </w:pPr>
-      <w:r>
-        <w:rPr>
-          <w:rFonts w:ascii="Lucida Console" w:hAnsi="Lucida Console"/>
-        </w:rPr>
-        <w:t>int c</w:t>
-      </w:r>
-      <w:r>
-        <w:rPr>
-          <w:rFonts w:ascii="Lucida Console" w:hAnsi="Lucida Console"/>
-        </w:rPr>
-        <w:t xml:space="preserve"> = </w:t>
-      </w:r>
-      <w:proofErr w:type="spellStart"/>
-      <w:r>
-        <w:rPr>
-          <w:rFonts w:ascii="Lucida Console" w:hAnsi="Lucida Console"/>
-        </w:rPr>
-        <w:t>cval</w:t>
-      </w:r>
-      <w:proofErr w:type="spellEnd"/>
-      <w:r>
-        <w:rPr>
-          <w:rFonts w:ascii="Lucida Console" w:hAnsi="Lucida Console"/>
-        </w:rPr>
-        <w:t>[chooser];</w:t>
-      </w:r>
-    </w:p>
-    <w:p>
-      <w:pPr>
-        <w:spacing w:after="0" w:line="240" w:lineRule="auto"/>
-      </w:pPr>
-      <w:r>
-        <w:rPr>
-          <w:rFonts w:ascii="Lucida Console" w:hAnsi="Lucida Console"/>
-        </w:rPr>
-        <w:t xml:space="preserve">int d = 4700 / </w:t>
-      </w:r>
-      <w:r>
-        <w:rPr>
-          <w:rFonts w:ascii="Lucida Console" w:hAnsi="Lucida Console"/>
-        </w:rPr>
-        <w:t>c</w:t>
-      </w:r>
-      <w:r>
-        <w:rPr>
-          <w:rFonts w:ascii="Lucida Console" w:hAnsi="Lucida Console"/>
-        </w:rPr>
-        <w:t>;</w:t>
-      </w:r>
+          <w:sz w:val="20"/>
+          <w:szCs w:val="20"/>
+        </w:rPr>
+      </w:pPr>
+      <w:r>
+        <w:rPr>
+          <w:rFonts w:ascii="Lucida Console" w:hAnsi="Lucida Console"/>
+          <w:sz w:val="20"/>
+          <w:szCs w:val="20"/>
+        </w:rPr>
+        <w:t>int x = 1, y = 5, z = 0;</w:t>
+      </w:r>
+      <w:r>
+        <w:rPr>
+          <w:rFonts w:ascii="Lucida Console" w:hAnsi="Lucida Console"/>
+          <w:sz w:val="20"/>
+          <w:szCs w:val="20"/>
+        </w:rPr>
+        <w:tab/>
+      </w:r>
+      <w:r>
+        <w:rPr>
+          <w:rFonts w:ascii="Lucida Console" w:hAnsi="Lucida Console"/>
+          <w:sz w:val="20"/>
+          <w:szCs w:val="20"/>
+        </w:rPr>
+        <w:tab/>
+      </w:r>
+    </w:p>
+    <w:p>
+      <w:pPr>
+        <w:spacing w:after="0" w:line="240" w:lineRule="auto"/>
+        <w:rPr>
+          <w:rFonts w:ascii="Lucida Console" w:hAnsi="Lucida Console"/>
+          <w:sz w:val="20"/>
+          <w:szCs w:val="20"/>
+        </w:rPr>
+      </w:pPr>
+      <w:r>
+        <w:rPr>
+          <w:rFonts w:ascii="Lucida Console" w:hAnsi="Lucida Console"/>
+          <w:sz w:val="20"/>
+          <w:szCs w:val="20"/>
+        </w:rPr>
+        <w:t>boolean chooser = true;</w:t>
+      </w:r>
+    </w:p>
+    <w:p>
+      <w:pPr>
+        <w:spacing w:after="0" w:line="240" w:lineRule="auto"/>
+        <w:rPr>
+          <w:rFonts w:ascii="Lucida Console" w:hAnsi="Lucida Console"/>
+          <w:sz w:val="20"/>
+          <w:szCs w:val="20"/>
+        </w:rPr>
+      </w:pPr>
+      <w:r>
+        <w:rPr>
+          <w:rFonts w:ascii="Lucida Console" w:hAnsi="Lucida Console"/>
+          <w:sz w:val="20"/>
+          <w:szCs w:val="20"/>
+        </w:rPr>
+        <w:t>System.out.println("\ninitial:: chooser:  " + chooser + "  x: " + x + "  y: " + y + "  z: " + z);</w:t>
+      </w:r>
+    </w:p>
+    <w:p>
+      <w:pPr>
+        <w:spacing w:after="0" w:line="240" w:lineRule="auto"/>
+        <w:rPr>
+          <w:rFonts w:ascii="Lucida Console" w:hAnsi="Lucida Console"/>
+          <w:sz w:val="20"/>
+          <w:szCs w:val="20"/>
+        </w:rPr>
+      </w:pPr>
+      <w:r>
+        <w:rPr>
+          <w:rFonts w:ascii="Lucida Console" w:hAnsi="Lucida Console"/>
+          <w:sz w:val="20"/>
+          <w:szCs w:val="20"/>
+        </w:rPr>
+        <w:t>z = chooser ? x + 1 : y + 1;</w:t>
+      </w:r>
+    </w:p>
+    <w:p>
+      <w:pPr>
+        <w:spacing w:after="0" w:line="240" w:lineRule="auto"/>
+        <w:rPr>
+          <w:rFonts w:ascii="Lucida Console" w:hAnsi="Lucida Console"/>
+          <w:sz w:val="20"/>
+          <w:szCs w:val="20"/>
+        </w:rPr>
+      </w:pPr>
+      <w:r>
+        <w:rPr>
+          <w:rFonts w:ascii="Lucida Console" w:hAnsi="Lucida Console"/>
+          <w:sz w:val="20"/>
+          <w:szCs w:val="20"/>
+        </w:rPr>
+        <w:t>System.out.println("post::    chooser:  " + chooser + "  x: " + x + "  y: " + y + "  z: " + z);</w:t>
+      </w:r>
+    </w:p>
+    <w:p>
+      <w:pPr>
+        <w:spacing w:after="0" w:line="240" w:lineRule="auto"/>
+        <w:rPr>
+          <w:rFonts w:ascii="Lucida Console" w:hAnsi="Lucida Console"/>
+          <w:sz w:val="20"/>
+          <w:szCs w:val="20"/>
+        </w:rPr>
+      </w:pPr>
+      <w:r>
+        <w:rPr>
+          <w:rFonts w:ascii="Lucida Console" w:hAnsi="Lucida Console"/>
+          <w:sz w:val="20"/>
+          <w:szCs w:val="20"/>
+        </w:rPr>
+        <w:t>chooser = false;</w:t>
+      </w:r>
+    </w:p>
+    <w:p>
+      <w:pPr>
+        <w:spacing w:after="0" w:line="240" w:lineRule="auto"/>
+        <w:rPr>
+          <w:rFonts w:ascii="Lucida Console" w:hAnsi="Lucida Console"/>
+          <w:sz w:val="20"/>
+          <w:szCs w:val="20"/>
+        </w:rPr>
+      </w:pPr>
+      <w:r>
+        <w:rPr>
+          <w:rFonts w:ascii="Lucida Console" w:hAnsi="Lucida Console"/>
+          <w:sz w:val="20"/>
+          <w:szCs w:val="20"/>
+        </w:rPr>
+        <w:t>System.out.println("\ninitial:: chooser:  " + chooser + "  x: " + x + "  y: " + y + "  z: " + z);</w:t>
+      </w:r>
+    </w:p>
+    <w:p>
+      <w:pPr>
+        <w:spacing w:after="0" w:line="240" w:lineRule="auto"/>
+        <w:rPr>
+          <w:rFonts w:ascii="Lucida Console" w:hAnsi="Lucida Console"/>
+          <w:sz w:val="20"/>
+          <w:szCs w:val="20"/>
+        </w:rPr>
+      </w:pPr>
+      <w:r>
+        <w:rPr>
+          <w:rFonts w:ascii="Lucida Console" w:hAnsi="Lucida Console"/>
+          <w:sz w:val="20"/>
+          <w:szCs w:val="20"/>
+        </w:rPr>
+        <w:t>z = chooser ? x + 1 : y + 1;</w:t>
+      </w:r>
+    </w:p>
+    <w:p>
+      <w:pPr>
+        <w:spacing w:after="0" w:line="240" w:lineRule="auto"/>
+        <w:rPr>
+          <w:rFonts w:ascii="Lucida Console" w:hAnsi="Lucida Console"/>
+          <w:sz w:val="20"/>
+          <w:szCs w:val="20"/>
+        </w:rPr>
+      </w:pPr>
+      <w:r>
+        <w:rPr>
+          <w:rFonts w:ascii="Lucida Console" w:hAnsi="Lucida Console"/>
+          <w:sz w:val="20"/>
+          <w:szCs w:val="20"/>
+        </w:rPr>
+        <w:t>System.out.println("post::    chooser:  " + chooser + "  x: " + x + "  y: " + y + "  z: " + z);</w:t>
+      </w:r>
+    </w:p>
+    <w:p>
+      <w:pPr>
+        <w:spacing w:after="0" w:line="240" w:lineRule="auto"/>
+      </w:pPr>
+    </w:p>
+    <w:p>
+      <w:pPr>
+        <w:spacing w:after="0" w:line="240" w:lineRule="auto"/>
+      </w:pPr>
+      <w:r>
+        <w:t xml:space="preserve">Note the “chooser” Boolean variable selects one of the two expressions. This code </w:t>
+      </w:r>
+      <w:r>
+        <w:t xml:space="preserve">transforms to </w:t>
+      </w:r>
+      <w:r>
+        <w:t>the</w:t>
+      </w:r>
+      <w:r>
+        <w:t xml:space="preserve"> Java sequence</w:t>
+      </w:r>
+      <w:r>
+        <w:t xml:space="preserve"> </w:t>
+      </w:r>
+      <w:r>
+        <w:t xml:space="preserve">shown </w:t>
+      </w:r>
+      <w:r>
+        <w:t>below</w:t>
+      </w:r>
+      <w:r>
+        <w:t>:</w:t>
+      </w:r>
+    </w:p>
+    <w:p>
+      <w:pPr>
+        <w:spacing w:after="0" w:line="240" w:lineRule="auto"/>
+      </w:pPr>
+    </w:p>
+    <w:p>
+      <w:pPr>
+        <w:spacing w:after="0" w:line="240" w:lineRule="auto"/>
+        <w:rPr>
+          <w:rFonts w:ascii="Lucida Console" w:hAnsi="Lucida Console"/>
+          <w:sz w:val="20"/>
+          <w:szCs w:val="20"/>
+        </w:rPr>
+      </w:pPr>
+      <w:r>
+        <w:rPr>
+          <w:rFonts w:ascii="Lucida Console" w:hAnsi="Lucida Console"/>
+          <w:sz w:val="20"/>
+          <w:szCs w:val="20"/>
+        </w:rPr>
+        <w:t>int x = 1, y = 5, z = 0;</w:t>
+      </w:r>
+    </w:p>
+    <w:p>
+      <w:pPr>
+        <w:spacing w:after="0" w:line="240" w:lineRule="auto"/>
+        <w:rPr>
+          <w:rFonts w:ascii="Lucida Console" w:hAnsi="Lucida Console"/>
+          <w:sz w:val="20"/>
+          <w:szCs w:val="20"/>
+        </w:rPr>
+      </w:pPr>
+      <w:r>
+        <w:rPr>
+          <w:rFonts w:ascii="Lucida Console" w:hAnsi="Lucida Console"/>
+          <w:sz w:val="20"/>
+          <w:szCs w:val="20"/>
+        </w:rPr>
+        <w:t>int[] alternatives = { x + 1, y + 1 };</w:t>
+      </w:r>
+    </w:p>
+    <w:p>
+      <w:pPr>
+        <w:spacing w:after="0" w:line="240" w:lineRule="auto"/>
+        <w:rPr>
+          <w:rFonts w:ascii="Lucida Console" w:hAnsi="Lucida Console"/>
+          <w:sz w:val="20"/>
+          <w:szCs w:val="20"/>
+        </w:rPr>
+      </w:pPr>
+      <w:r>
+        <w:rPr>
+          <w:rFonts w:ascii="Lucida Console" w:hAnsi="Lucida Console"/>
+          <w:sz w:val="20"/>
+          <w:szCs w:val="20"/>
+        </w:rPr>
+        <w:t>System.out.println("\nSetup:   x: " + x + "  y: " + y + "  Alternatives: [" + alternatives[0] + ", "</w:t>
+      </w:r>
+      <w:r>
+        <w:rPr>
+          <w:rFonts w:ascii="Lucida Console" w:hAnsi="Lucida Console"/>
+          <w:sz w:val="20"/>
+          <w:szCs w:val="20"/>
+        </w:rPr>
+        <w:t xml:space="preserve"> </w:t>
+      </w:r>
+      <w:r>
+        <w:rPr>
+          <w:rFonts w:ascii="Lucida Console" w:hAnsi="Lucida Console"/>
+          <w:sz w:val="20"/>
+          <w:szCs w:val="20"/>
+        </w:rPr>
+        <w:t>+ alternatives[1] + "]");</w:t>
+      </w:r>
+    </w:p>
+    <w:p>
+      <w:pPr>
+        <w:spacing w:after="0" w:line="240" w:lineRule="auto"/>
+        <w:rPr>
+          <w:rFonts w:ascii="Lucida Console" w:hAnsi="Lucida Console"/>
+          <w:sz w:val="20"/>
+          <w:szCs w:val="20"/>
+        </w:rPr>
+      </w:pPr>
+      <w:r>
+        <w:rPr>
+          <w:rFonts w:ascii="Lucida Console" w:hAnsi="Lucida Console"/>
+          <w:sz w:val="20"/>
+          <w:szCs w:val="20"/>
+        </w:rPr>
+        <w:t>int chooser = 0;</w:t>
+      </w:r>
+    </w:p>
+    <w:p>
+      <w:pPr>
+        <w:spacing w:after="0" w:line="240" w:lineRule="auto"/>
+        <w:rPr>
+          <w:rFonts w:ascii="Lucida Console" w:hAnsi="Lucida Console"/>
+          <w:sz w:val="20"/>
+          <w:szCs w:val="20"/>
+        </w:rPr>
+      </w:pPr>
+      <w:r>
+        <w:rPr>
+          <w:rFonts w:ascii="Lucida Console" w:hAnsi="Lucida Console"/>
+          <w:sz w:val="20"/>
+          <w:szCs w:val="20"/>
+        </w:rPr>
+        <w:t>z = alternatives[chooser];</w:t>
+      </w:r>
+    </w:p>
+    <w:p>
+      <w:pPr>
+        <w:spacing w:after="0" w:line="240" w:lineRule="auto"/>
+        <w:rPr>
+          <w:rFonts w:ascii="Lucida Console" w:hAnsi="Lucida Console"/>
+          <w:sz w:val="20"/>
+          <w:szCs w:val="20"/>
+        </w:rPr>
+      </w:pPr>
+      <w:r>
+        <w:rPr>
+          <w:rFonts w:ascii="Lucida Console" w:hAnsi="Lucida Console"/>
+          <w:sz w:val="20"/>
+          <w:szCs w:val="20"/>
+        </w:rPr>
+        <w:t>System.out.println("post::   chooser:  " + chooser + "  z: " + z);</w:t>
+      </w:r>
+    </w:p>
+    <w:p>
+      <w:pPr>
+        <w:spacing w:after="0" w:line="240" w:lineRule="auto"/>
+        <w:rPr>
+          <w:rFonts w:ascii="Lucida Console" w:hAnsi="Lucida Console"/>
+          <w:sz w:val="20"/>
+          <w:szCs w:val="20"/>
+        </w:rPr>
+      </w:pPr>
+      <w:r>
+        <w:rPr>
+          <w:rFonts w:ascii="Lucida Console" w:hAnsi="Lucida Console"/>
+          <w:sz w:val="20"/>
+          <w:szCs w:val="20"/>
+        </w:rPr>
+        <w:t>chooser = 1;</w:t>
+      </w:r>
+    </w:p>
+    <w:p>
+      <w:pPr>
+        <w:spacing w:after="0" w:line="240" w:lineRule="auto"/>
+        <w:rPr>
+          <w:rFonts w:ascii="Lucida Console" w:hAnsi="Lucida Console"/>
+          <w:sz w:val="20"/>
+          <w:szCs w:val="20"/>
+        </w:rPr>
+      </w:pPr>
+      <w:r>
+        <w:rPr>
+          <w:rFonts w:ascii="Lucida Console" w:hAnsi="Lucida Console"/>
+          <w:sz w:val="20"/>
+          <w:szCs w:val="20"/>
+        </w:rPr>
+        <w:t>z = alternatives[chooser];</w:t>
+      </w:r>
+    </w:p>
+    <w:p>
+      <w:pPr>
+        <w:spacing w:after="0" w:line="240" w:lineRule="auto"/>
+        <w:rPr>
+          <w:rFonts w:ascii="Lucida Console" w:hAnsi="Lucida Console"/>
+          <w:sz w:val="20"/>
+          <w:szCs w:val="20"/>
+        </w:rPr>
+      </w:pPr>
+      <w:r>
+        <w:rPr>
+          <w:rFonts w:ascii="Lucida Console" w:hAnsi="Lucida Console"/>
+          <w:sz w:val="20"/>
+          <w:szCs w:val="20"/>
+        </w:rPr>
+        <w:t>System.out.println("post::   chooser:  " + chooser + "  z: " + z);</w:t>
+      </w:r>
+    </w:p>
+    <w:p>
+      <w:pPr>
+        <w:spacing w:after="0" w:line="240" w:lineRule="auto"/>
+      </w:pPr>
+    </w:p>
+    <w:p>
+      <w:pPr>
+        <w:spacing w:after="0" w:line="240" w:lineRule="auto"/>
+      </w:pPr>
+      <w:r>
+        <w:t>We use</w:t>
+      </w:r>
+      <w:r>
+        <w:t xml:space="preserve"> BNF to define the transformation as follows:</w:t>
+      </w:r>
+    </w:p>
+    <w:p>
+      <w:pPr>
+        <w:spacing w:after="0" w:line="240" w:lineRule="auto"/>
+      </w:pPr>
+    </w:p>
+    <w:p>
+      <w:pPr>
+        <w:spacing w:after="0" w:line="240" w:lineRule="auto"/>
+        <w:rPr>
+          <w:b/>
+          <w:bCs/>
+        </w:rPr>
+      </w:pPr>
+      <w:r>
+        <w:rPr>
+          <w:b/>
+          <w:bCs/>
+        </w:rPr>
+        <w:t>Ternary IF:</w:t>
+      </w:r>
+    </w:p>
+    <w:p>
+      <w:pPr>
+        <w:spacing w:after="0" w:line="240" w:lineRule="auto"/>
+      </w:pPr>
+      <w:r>
+        <w:t>&lt;Expression&gt; ::= a defined sequence of operations resulting in a single value</w:t>
+      </w:r>
+    </w:p>
+    <w:p>
+      <w:pPr>
+        <w:spacing w:after="0" w:line="240" w:lineRule="auto"/>
+      </w:pPr>
+      <w:r>
+        <w:t>&lt;Boolean&gt; ::= is an expression with a logical value (true or false)</w:t>
+      </w:r>
+    </w:p>
+    <w:p>
+      <w:pPr>
+        <w:spacing w:after="0" w:line="240" w:lineRule="auto"/>
+      </w:pPr>
+      <w:r>
+        <w:t>&lt;Chooser&gt; ::= &lt;Boolean&gt;</w:t>
+      </w:r>
+      <w:r>
+        <w:t xml:space="preserve"> expression</w:t>
+      </w:r>
+    </w:p>
+    <w:p>
+      <w:pPr>
+        <w:spacing w:after="0" w:line="240" w:lineRule="auto"/>
+      </w:pPr>
+      <w:r>
+        <w:t>&lt;True_value&gt; ::= an Expression associated</w:t>
+      </w:r>
+      <w:r>
+        <w:t xml:space="preserve"> with &lt;Chooser&gt; evaluating to true</w:t>
+      </w:r>
+    </w:p>
+    <w:p>
+      <w:pPr>
+        <w:spacing w:after="0" w:line="240" w:lineRule="auto"/>
+      </w:pPr>
+      <w:r>
+        <w:lastRenderedPageBreak/>
+        <w:t>&lt;False_value&gt; ::= an Expression associated with &lt;Chooser&gt; evaluating to false</w:t>
+      </w:r>
+    </w:p>
+    <w:p>
+      <w:pPr>
+        <w:spacing w:after="0" w:line="240" w:lineRule="auto"/>
+      </w:pPr>
+      <w:r>
+        <w:t>&lt;Ternary_IF&gt; ::= &lt;Chooser&gt; ? &lt;True_value&gt; : &lt;False_value&gt;</w:t>
+      </w:r>
+    </w:p>
+    <w:p>
+      <w:pPr>
+        <w:spacing w:after="0" w:line="240" w:lineRule="auto"/>
+        <w:rPr>
+          <w:b/>
+          <w:bCs/>
+        </w:rPr>
+      </w:pPr>
+    </w:p>
+    <w:p>
+      <w:pPr>
+        <w:spacing w:after="0" w:line="240" w:lineRule="auto"/>
+      </w:pPr>
+      <w:r>
+        <w:rPr>
+          <w:b/>
+          <w:bCs/>
+        </w:rPr>
+        <w:t>Semantic Note</w:t>
+      </w:r>
+      <w:r>
+        <w:t>: The &lt;Chooser&gt; is evaluated first, and if it is true, the resulting expression is the value associated with &lt;True_value&gt;; otherwise, the resulting expression is the value associated with the &lt;False_value&gt;.</w:t>
+      </w:r>
+    </w:p>
+    <w:p>
+      <w:pPr>
+        <w:spacing w:after="0" w:line="240" w:lineRule="auto"/>
+      </w:pPr>
+    </w:p>
+    <w:p>
+      <w:pPr>
+        <w:spacing w:after="0" w:line="240" w:lineRule="auto"/>
+        <w:rPr>
+          <w:b/>
+          <w:bCs/>
+        </w:rPr>
+      </w:pPr>
+      <w:r>
+        <w:rPr>
+          <w:b/>
+          <w:bCs/>
+        </w:rPr>
+        <w:t>Transformation:</w:t>
+      </w:r>
+    </w:p>
+    <w:p>
+      <w:pPr>
+        <w:spacing w:after="0" w:line="240" w:lineRule="auto"/>
+      </w:pPr>
+      <w:r>
+        <w:t xml:space="preserve">&lt;Pre-compute&gt; ::= A two element array </w:t>
+      </w:r>
+      <w:r>
+        <w:t>storing</w:t>
+      </w:r>
+      <w:r>
+        <w:t xml:space="preserve"> &lt;Expression&gt; values</w:t>
+      </w:r>
+    </w:p>
+    <w:p>
+      <w:pPr>
+        <w:spacing w:after="0" w:line="240" w:lineRule="auto"/>
+      </w:pPr>
+      <w:r>
+        <w:t>&lt;Setup0&gt; ::= Assign element 0 of &lt;</w:t>
+      </w:r>
+      <w:r>
+        <w:t>Pre-compute</w:t>
+      </w:r>
+      <w:r>
+        <w:t xml:space="preserve">&gt; with </w:t>
+      </w:r>
+      <w:r>
+        <w:t>&lt;</w:t>
+      </w:r>
+      <w:r>
+        <w:t>False</w:t>
+      </w:r>
+      <w:r>
+        <w:t>_value&gt;</w:t>
+      </w:r>
+    </w:p>
+    <w:p>
+      <w:pPr>
+        <w:spacing w:after="0" w:line="240" w:lineRule="auto"/>
+      </w:pPr>
+      <w:r>
+        <w:t>&lt;Setup</w:t>
+      </w:r>
+      <w:r>
+        <w:t>1</w:t>
+      </w:r>
+      <w:r>
+        <w:t xml:space="preserve">&gt; ::= Assign element </w:t>
+      </w:r>
+      <w:r>
+        <w:t>1</w:t>
+      </w:r>
+      <w:r>
+        <w:t xml:space="preserve"> of &lt;Pre-compute&gt; with &lt;True_value&gt;</w:t>
+      </w:r>
+    </w:p>
+    <w:p>
+      <w:pPr>
+        <w:spacing w:after="0" w:line="240" w:lineRule="auto"/>
+      </w:pPr>
+      <w:r>
+        <w:t>&lt;Condition&gt; ::= Convert &lt;Chooser&gt; such that false has value zero and true has value one</w:t>
+      </w:r>
+    </w:p>
+    <w:p>
+      <w:pPr>
+        <w:spacing w:after="0" w:line="240" w:lineRule="auto"/>
+      </w:pPr>
+      <w:r>
+        <w:t>&lt;Transformed_Terminary_IF&gt; ::= &lt;Pre-compute&gt;[&lt;Condition&gt;]</w:t>
+      </w:r>
+    </w:p>
+    <w:p>
+      <w:pPr>
+        <w:spacing w:after="0" w:line="240" w:lineRule="auto"/>
+      </w:pPr>
+    </w:p>
+    <w:p>
+      <w:pPr>
+        <w:spacing w:after="0" w:line="240" w:lineRule="auto"/>
+      </w:pPr>
+      <w:r>
+        <w:rPr>
+          <w:b/>
+          <w:bCs/>
+        </w:rPr>
+        <w:t>Semantic Note:</w:t>
+      </w:r>
+      <w:r>
+        <w:t xml:space="preserve"> The &lt;Pre-compute&gt; array should be allocated off the heap and released in C using the </w:t>
+      </w:r>
+      <w:r>
+        <w:rPr>
+          <w:rFonts w:ascii="Lucida Console" w:hAnsi="Lucida Console"/>
+          <w:i/>
+          <w:iCs/>
+        </w:rPr>
+        <w:t>free</w:t>
+      </w:r>
+      <w:r>
+        <w:t xml:space="preserve"> method.</w:t>
+      </w:r>
+    </w:p>
+    <w:p>
+      <w:pPr>
+        <w:spacing w:after="0" w:line="240" w:lineRule="auto"/>
+      </w:pPr>
+    </w:p>
+    <w:p>
+      <w:pPr>
+        <w:spacing w:after="0" w:line="240" w:lineRule="auto"/>
+        <w:rPr>
+          <w:b/>
+          <w:bCs/>
+        </w:rPr>
+      </w:pPr>
+      <w:r>
+        <w:rPr>
+          <w:b/>
+          <w:bCs/>
+        </w:rPr>
+        <w:t>How to Transform:</w:t>
+      </w:r>
+    </w:p>
+    <w:p>
+      <w:pPr>
+        <w:spacing w:after="0" w:line="240" w:lineRule="auto"/>
+      </w:pPr>
+    </w:p>
+    <w:p>
+      <w:pPr>
+        <w:spacing w:after="0" w:line="240" w:lineRule="auto"/>
+      </w:pPr>
+      <w:r>
+        <w:t xml:space="preserve">You will find and uploaded Java or C (Not C++) file named </w:t>
+      </w:r>
+      <w:r>
+        <w:rPr>
+          <w:b/>
+          <w:bCs/>
+        </w:rPr>
+        <w:t>Foo.java</w:t>
+      </w:r>
+      <w:r>
+        <w:t xml:space="preserve"> or </w:t>
+      </w:r>
+      <w:r>
+        <w:rPr>
+          <w:b/>
+          <w:bCs/>
+        </w:rPr>
+        <w:t>Foo.c</w:t>
+      </w:r>
+      <w:r>
+        <w:t>. That</w:t>
+      </w:r>
+      <w:r>
+        <w:t xml:space="preserve"> input</w:t>
+      </w:r>
+      <w:r>
+        <w:t xml:space="preserve"> file contains a “main” method</w:t>
+      </w:r>
+      <w:r>
+        <w:t xml:space="preserve"> to transform</w:t>
+      </w:r>
+      <w:r>
+        <w:t>. You will output a transformed version of that file where the ternary IF operators are replaced using the transformation defined above.</w:t>
+      </w:r>
+    </w:p>
+    <w:p>
+      <w:pPr>
+        <w:spacing w:after="0" w:line="240" w:lineRule="auto"/>
+      </w:pPr>
+    </w:p>
+    <w:p>
+      <w:pPr>
+        <w:spacing w:after="0" w:line="240" w:lineRule="auto"/>
+      </w:pPr>
+    </w:p>
+    <w:p>
+      <w:pPr>
+        <w:spacing w:after="0" w:line="240" w:lineRule="auto"/>
+      </w:pPr>
+    </w:p>
+    <w:p>
+      <w:pPr>
+        <w:spacing w:after="0" w:line="240" w:lineRule="auto"/>
+      </w:pPr>
+    </w:p>
+    <w:p>
+      <w:pPr>
+        <w:spacing w:after="0" w:line="240" w:lineRule="auto"/>
+      </w:pPr>
     </w:p>
     <w:sectPr>
-      <w:pgSz w:w="12240" w:h="15840"/>
+      <w:pgSz w:w="15840" w:h="12240" w:orient="landscape"/>
       <w:pgMar w:top="1440" w:right="1440" w:bottom="1440" w:left="1440" w:header="720" w:footer="720" w:gutter="0"/>
       <w:cols w:space="720"/>
       <w:docGrid w:linePitch="360"/>
@@ -1022,6 +1421,7 @@
   <w:style w:type="character" w:default="1" w:styleId="DefaultParagraphFont">
     <w:name w:val="Default Paragraph Font"/>
     <w:uiPriority w:val="1"/>
+    <w:semiHidden/>
     <w:unhideWhenUsed/>
   </w:style>
   <w:style w:type="table" w:default="1" w:styleId="TableNormal">

</xml_diff>